<commit_message>
Fechamento do dia: criacao da aba credenciamento com layout escuro
</commit_message>
<xml_diff>
--- a/regulamento-regras/Pesquisa de satisfação.docx
+++ b/regulamento-regras/Pesquisa de satisfação.docx
@@ -601,44 +601,42 @@
     </w:p>
     <w:p>
       <w:pPr>
+        <w:spacing w:after="0" w:line="240" w:lineRule="auto"/>
+        <w:rPr>
+          <w:rFonts w:cstheme="minorHAnsi"/>
+        </w:rPr>
+      </w:pPr>
+    </w:p>
+    <w:p>
+      <w:pPr>
         <w:pStyle w:val="PargrafodaLista"/>
         <w:numPr>
           <w:ilvl w:val="0"/>
           <w:numId w:val="1"/>
         </w:numPr>
         <w:spacing w:after="0" w:line="240" w:lineRule="auto"/>
-        <w:rPr>
-          <w:rFonts w:cstheme="minorHAnsi"/>
-        </w:rPr>
-      </w:pPr>
-      <w:r>
-        <w:rPr>
-          <w:rFonts w:cstheme="minorHAnsi"/>
-        </w:rPr>
-        <w:lastRenderedPageBreak/>
-        <w:t>Qual sua nota para a Arbitragem?</w:t>
-      </w:r>
-    </w:p>
-    <w:p>
-      <w:pPr>
-        <w:spacing w:after="0" w:line="240" w:lineRule="auto"/>
-        <w:rPr>
-          <w:rFonts w:cstheme="minorHAnsi"/>
-        </w:rPr>
-      </w:pPr>
-      <w:r>
-        <w:rPr>
-          <w:rFonts w:cstheme="minorHAnsi"/>
-        </w:rPr>
-        <w:t>⃝ 1   ⃝ 2   ⃝ 3   ⃝ 4   ⃝ 5</w:t>
-      </w:r>
-    </w:p>
-    <w:p>
-      <w:pPr>
-        <w:spacing w:after="0" w:line="240" w:lineRule="auto"/>
-        <w:rPr>
-          <w:rFonts w:cstheme="minorHAnsi"/>
-        </w:rPr>
+      </w:pPr>
+      <w:r>
+        <w:t>Gostou do show musical?</w:t>
+      </w:r>
+    </w:p>
+    <w:p>
+      <w:pPr>
+        <w:spacing w:after="0" w:line="240" w:lineRule="auto"/>
+        <w:rPr>
+          <w:rFonts w:cstheme="minorHAnsi"/>
+        </w:rPr>
+      </w:pPr>
+      <w:r>
+        <w:rPr>
+          <w:rFonts w:cstheme="minorHAnsi"/>
+        </w:rPr>
+        <w:t>⃝ Sim    ⃝ Não</w:t>
+      </w:r>
+    </w:p>
+    <w:p>
+      <w:pPr>
+        <w:spacing w:after="0" w:line="240" w:lineRule="auto"/>
       </w:pPr>
     </w:p>
     <w:p>
@@ -649,15 +647,9 @@
           <w:numId w:val="1"/>
         </w:numPr>
         <w:spacing w:after="0" w:line="240" w:lineRule="auto"/>
-        <w:rPr>
-          <w:rFonts w:cstheme="minorHAnsi"/>
-        </w:rPr>
-      </w:pPr>
-      <w:r>
-        <w:rPr>
-          <w:rFonts w:cstheme="minorHAnsi"/>
-        </w:rPr>
-        <w:t>Pretende participar do próximo torneio, dia 5 de dezembro?</w:t>
+      </w:pPr>
+      <w:r>
+        <w:t>O samba combinou bem com o torneio de dominó?</w:t>
       </w:r>
     </w:p>
     <w:p>
@@ -681,6 +673,39 @@
           <w:rFonts w:cstheme="minorHAnsi"/>
         </w:rPr>
       </w:pPr>
+    </w:p>
+    <w:p>
+      <w:pPr>
+        <w:pStyle w:val="PargrafodaLista"/>
+        <w:numPr>
+          <w:ilvl w:val="0"/>
+          <w:numId w:val="1"/>
+        </w:numPr>
+        <w:spacing w:after="0" w:line="240" w:lineRule="auto"/>
+        <w:rPr>
+          <w:rFonts w:cstheme="minorHAnsi"/>
+        </w:rPr>
+      </w:pPr>
+      <w:r>
+        <w:rPr>
+          <w:rFonts w:cstheme="minorHAnsi"/>
+        </w:rPr>
+        <w:t>Pretende participar do próximo torneio, que deverá acontecer na primeira quinzena de dezembro?</w:t>
+      </w:r>
+    </w:p>
+    <w:p>
+      <w:pPr>
+        <w:spacing w:after="0" w:line="240" w:lineRule="auto"/>
+        <w:rPr>
+          <w:rFonts w:cstheme="minorHAnsi"/>
+        </w:rPr>
+      </w:pPr>
+      <w:r>
+        <w:rPr>
+          <w:rFonts w:cstheme="minorHAnsi"/>
+        </w:rPr>
+        <w:t>⃝ Sim    ⃝ Não</w:t>
+      </w:r>
     </w:p>
     <w:p>
       <w:pPr>
@@ -788,8 +813,100 @@
       </w:pPr>
     </w:lvl>
   </w:abstractNum>
+  <w:abstractNum w:abstractNumId="1" w15:restartNumberingAfterBreak="0">
+    <w:nsid w:val="71D13A3D"/>
+    <w:multiLevelType w:val="hybridMultilevel"/>
+    <w:tmpl w:val="E6946C78"/>
+    <w:lvl w:ilvl="0" w:tplc="FFFFFFFF">
+      <w:start w:val="1"/>
+      <w:numFmt w:val="decimal"/>
+      <w:lvlText w:val="%1."/>
+      <w:lvlJc w:val="left"/>
+      <w:pPr>
+        <w:ind w:left="720" w:hanging="360"/>
+      </w:pPr>
+      <w:rPr>
+        <w:rFonts w:hint="default"/>
+      </w:rPr>
+    </w:lvl>
+    <w:lvl w:ilvl="1" w:tplc="FFFFFFFF" w:tentative="1">
+      <w:start w:val="1"/>
+      <w:numFmt w:val="lowerLetter"/>
+      <w:lvlText w:val="%2."/>
+      <w:lvlJc w:val="left"/>
+      <w:pPr>
+        <w:ind w:left="1440" w:hanging="360"/>
+      </w:pPr>
+    </w:lvl>
+    <w:lvl w:ilvl="2" w:tplc="FFFFFFFF" w:tentative="1">
+      <w:start w:val="1"/>
+      <w:numFmt w:val="lowerRoman"/>
+      <w:lvlText w:val="%3."/>
+      <w:lvlJc w:val="right"/>
+      <w:pPr>
+        <w:ind w:left="2160" w:hanging="180"/>
+      </w:pPr>
+    </w:lvl>
+    <w:lvl w:ilvl="3" w:tplc="FFFFFFFF" w:tentative="1">
+      <w:start w:val="1"/>
+      <w:numFmt w:val="decimal"/>
+      <w:lvlText w:val="%4."/>
+      <w:lvlJc w:val="left"/>
+      <w:pPr>
+        <w:ind w:left="2880" w:hanging="360"/>
+      </w:pPr>
+    </w:lvl>
+    <w:lvl w:ilvl="4" w:tplc="FFFFFFFF" w:tentative="1">
+      <w:start w:val="1"/>
+      <w:numFmt w:val="lowerLetter"/>
+      <w:lvlText w:val="%5."/>
+      <w:lvlJc w:val="left"/>
+      <w:pPr>
+        <w:ind w:left="3600" w:hanging="360"/>
+      </w:pPr>
+    </w:lvl>
+    <w:lvl w:ilvl="5" w:tplc="FFFFFFFF" w:tentative="1">
+      <w:start w:val="1"/>
+      <w:numFmt w:val="lowerRoman"/>
+      <w:lvlText w:val="%6."/>
+      <w:lvlJc w:val="right"/>
+      <w:pPr>
+        <w:ind w:left="4320" w:hanging="180"/>
+      </w:pPr>
+    </w:lvl>
+    <w:lvl w:ilvl="6" w:tplc="FFFFFFFF" w:tentative="1">
+      <w:start w:val="1"/>
+      <w:numFmt w:val="decimal"/>
+      <w:lvlText w:val="%7."/>
+      <w:lvlJc w:val="left"/>
+      <w:pPr>
+        <w:ind w:left="5040" w:hanging="360"/>
+      </w:pPr>
+    </w:lvl>
+    <w:lvl w:ilvl="7" w:tplc="FFFFFFFF" w:tentative="1">
+      <w:start w:val="1"/>
+      <w:numFmt w:val="lowerLetter"/>
+      <w:lvlText w:val="%8."/>
+      <w:lvlJc w:val="left"/>
+      <w:pPr>
+        <w:ind w:left="5760" w:hanging="360"/>
+      </w:pPr>
+    </w:lvl>
+    <w:lvl w:ilvl="8" w:tplc="FFFFFFFF" w:tentative="1">
+      <w:start w:val="1"/>
+      <w:numFmt w:val="lowerRoman"/>
+      <w:lvlText w:val="%9."/>
+      <w:lvlJc w:val="right"/>
+      <w:pPr>
+        <w:ind w:left="6480" w:hanging="180"/>
+      </w:pPr>
+    </w:lvl>
+  </w:abstractNum>
   <w:num w:numId="1" w16cid:durableId="2092656903">
     <w:abstractNumId w:val="0"/>
+  </w:num>
+  <w:num w:numId="2" w16cid:durableId="2121102386">
+    <w:abstractNumId w:val="1"/>
   </w:num>
 </w:numbering>
 </file>

</xml_diff>